<commit_message>
atas assinadas e ebook sprinti formato ABNT
</commit_message>
<xml_diff>
--- a/Docs/Ebook_SprintI_MarcosMusic.docx
+++ b/Docs/Ebook_SprintI_MarcosMusic.docx
@@ -1,3 +1,371 @@
+
+<file path=word/document.xml><?xml version="1.0" encoding="utf-8"?>
+<w:document xmlns:wpc="http://schemas.microsoft.com/office/word/2010/wordprocessingCanvas" xmlns:mo="http://schemas.microsoft.com/office/mac/office/2008/main" xmlns:mc="http://schemas.openxmlformats.org/markup-compatibility/2006" xmlns:mv="urn:schemas-microsoft-com:mac:vml" xmlns:o="urn:schemas-microsoft-com:office:office" xmlns:r="http://schemas.openxmlformats.org/officeDocument/2006/relationships" xmlns:m="http://schemas.openxmlformats.org/officeDocument/2006/math" xmlns:v="urn:schemas-microsoft-com:vml" xmlns:wp14="http://schemas.microsoft.com/office/word/2010/wordprocessingDrawing" xmlns:wp="http://schemas.openxmlformats.org/drawingml/2006/wordprocessingDrawing" xmlns:w10="urn:schemas-microsoft-com:office:word" xmlns:w="http://schemas.openxmlformats.org/wordprocessingml/2006/main" xmlns:w14="http://schemas.microsoft.com/office/word/2010/wordml" xmlns:wpg="http://schemas.microsoft.com/office/word/2010/wordprocessingGroup" xmlns:wpi="http://schemas.microsoft.com/office/word/2010/wordprocessingInk" xmlns:wne="http://schemas.microsoft.com/office/word/2006/wordml" xmlns:wps="http://schemas.microsoft.com/office/word/2010/wordprocessingShape" mc:Ignorable="w14 wp14">
+  <w:body>
+    <w:p>
+      <w:pPr>
+        <w:pStyle w:val="Heading1"/>
+        <w:jc w:val="center"/>
+        <w:rPr>
+          <w:rFonts w:hint="eastAsia"/>
+        </w:rPr>
+      </w:pPr>
+      <w:r>
+        <w:t xml:space="preserve">Marcos Music: Sistema de Gestão de Aulas de Música, E-Book Sprint I</w:t>
+      </w:r>
+    </w:p>
+    <w:p/>
+    <w:p>
+      <w:pPr>
+        <w:jc w:val="center"/>
+      </w:pPr>
+      <w:r>
+        <w:t xml:space="preserve">Artur Costa Cavalcante Coelho, Bernardo Parreiras Prado, João Paulo Aguiar Prado, Paulo Victor Fernandes de Araujo Silva, Rafael Nagem Volpini</w:t>
+      </w:r>
+    </w:p>
+    <w:p/>
+    <w:p>
+      <w:pPr>
+        <w:pStyle w:val="ListParagraph"/>
+        <w:numPr>
+          <w:ilvl w:val="0"/>
+          <w:numId w:val="1"/>
+        </w:numPr>
+        <w:rPr>
+          <w:rFonts w:ascii="Arial" w:hAnsi="Arial" w:cs="Arial"/>
+          <w:b/>
+          <w:sz w:val="24"/>
+          <w:szCs w:val="24"/>
+        </w:rPr>
+      </w:pPr>
+      <w:r>
+        <w:rPr>
+          <w:rFonts w:ascii="Arial" w:hAnsi="Arial" w:cs="Arial"/>
+          <w:b/>
+          <w:sz w:val="24"/>
+          <w:szCs w:val="24"/>
+        </w:rPr>
+        <w:t>Resumo</w:t>
+      </w:r>
+    </w:p>
+    <w:p>
+      <w:pPr>
+        <w:ind w:left="360"/>
+        <w:jc w:val="both"/>
+      </w:pPr>
+      <w:r>
+        <w:rPr>
+          <w:rFonts w:ascii="Arial" w:hAnsi="Arial" w:cs="Arial"/>
+          <w:sz w:val="24"/>
+          <w:szCs w:val="24"/>
+        </w:rPr>
+        <w:t xml:space="preserve">O presente trabalho descreve o desenvolvimento do sistema Marcos Music, uma plataforma web para gestão de aulas de música particulares. Motivado pelas dificuldades enfrentadas pelo professor Marcos Mello Lima na administração manual de sua agenda — com dezenas de alunos em múltiplos instrumentos —, o sistema propõe a digitalização centralizada de processos como agendamento, controle de reposições com créditos, notificações e integração com Google Calendar e Google Meet. A solução adota arquitetura em três camadas com React/TypeScript no frontend e Java Spring Boot no backend, comunicando-se via API RESTful com autenticação JWT. A Sprint I entregou a fundação técnica e documental do projeto, com requisitos levantados junto ao stakeholder, arquitetura definida e primeiras telas validadas.</w:t>
+      </w:r>
+    </w:p>
+    <w:p>
+      <w:pPr>
+        <w:pStyle w:val="ListParagraph"/>
+        <w:numPr>
+          <w:ilvl w:val="0"/>
+          <w:numId w:val="1"/>
+        </w:numPr>
+        <w:rPr>
+          <w:rFonts w:ascii="Arial" w:hAnsi="Arial" w:cs="Arial"/>
+          <w:b/>
+          <w:sz w:val="24"/>
+          <w:szCs w:val="24"/>
+        </w:rPr>
+      </w:pPr>
+      <w:r>
+        <w:rPr>
+          <w:rFonts w:ascii="Arial" w:hAnsi="Arial" w:cs="Arial"/>
+          <w:b/>
+          <w:sz w:val="24"/>
+          <w:szCs w:val="24"/>
+        </w:rPr>
+        <w:t>Apresentação do problema</w:t>
+      </w:r>
+    </w:p>
+    <w:p>
+      <w:pPr>
+        <w:ind w:left="360"/>
+        <w:jc w:val="both"/>
+      </w:pPr>
+      <w:r>
+        <w:rPr>
+          <w:rFonts w:ascii="Arial" w:hAnsi="Arial" w:cs="Arial"/>
+          <w:sz w:val="24"/>
+          <w:szCs w:val="24"/>
+        </w:rPr>
+        <w:t xml:space="preserve">O professor particular de música Marcos Mello Lima realizava toda a gestão de sua agenda de aulas de forma completamente manual, utilizando apenas um bloco de notas físico. Com uma agenda tomada por alunos de segunda a sábado, reservava apenas o domingo à noite para organizar a semana seguinte, momento em que precisava revisar aulas, contabilizar faltas, encaixar reposições e anotar alterações. Esse modelo gerava conflitos de horário, perda de controle de reposições, sobrecarga de tempo e comunicação fragmentada entre professor e alunos, evidenciando a necessidade de uma solução digital centralizada.</w:t>
+      </w:r>
+    </w:p>
+    <w:p/>
+    <w:p>
+      <w:pPr>
+        <w:pStyle w:val="ListParagraph"/>
+        <w:numPr>
+          <w:ilvl w:val="0"/>
+          <w:numId w:val="1"/>
+        </w:numPr>
+        <w:rPr>
+          <w:rFonts w:ascii="Arial" w:hAnsi="Arial" w:cs="Arial"/>
+          <w:b/>
+          <w:sz w:val="24"/>
+          <w:szCs w:val="24"/>
+        </w:rPr>
+      </w:pPr>
+      <w:r>
+        <w:rPr>
+          <w:rFonts w:ascii="Arial" w:hAnsi="Arial" w:cs="Arial"/>
+          <w:b/>
+          <w:sz w:val="24"/>
+          <w:szCs w:val="24"/>
+        </w:rPr>
+        <w:t>Stakeholders</w:t>
+      </w:r>
+    </w:p>
+    <w:p>
+      <w:pPr>
+        <w:ind w:left="360"/>
+        <w:jc w:val="both"/>
+      </w:pPr>
+      <w:r>
+        <w:rPr>
+          <w:rFonts w:ascii="Arial" w:hAnsi="Arial" w:cs="Arial"/>
+          <w:sz w:val="24"/>
+          <w:szCs w:val="24"/>
+        </w:rPr>
+        <w:t xml:space="preserve">Marcos Mello Lima é professor particular de música há mais de uma década, lecionando individualmente para dezenas de alunos em diversas modalidades (violão, guitarra, cavaquinho, teclado, entre outros). Reserva apenas o domingo à noite para administrar sua agenda. É o solicitante direto do sistema e principal usuário do perfil de Professor/Administrador. Os alunos do professor são os demais usuários do sistema, podendo agendar reposições, enviar dúvidas e receber notificações pelo aplicativo.</w:t>
+      </w:r>
+    </w:p>
+    <w:p/>
+    <w:p>
+      <w:pPr>
+        <w:pStyle w:val="ListParagraph"/>
+        <w:numPr>
+          <w:ilvl w:val="0"/>
+          <w:numId w:val="1"/>
+        </w:numPr>
+        <w:rPr>
+          <w:rFonts w:ascii="Arial" w:hAnsi="Arial" w:cs="Arial"/>
+          <w:b/>
+          <w:sz w:val="24"/>
+          <w:szCs w:val="24"/>
+        </w:rPr>
+      </w:pPr>
+      <w:r>
+        <w:rPr>
+          <w:rFonts w:ascii="Arial" w:hAnsi="Arial" w:cs="Arial"/>
+          <w:b/>
+          <w:sz w:val="24"/>
+          <w:szCs w:val="24"/>
+        </w:rPr>
+        <w:t>Proposta da solução</w:t>
+      </w:r>
+    </w:p>
+    <w:p>
+      <w:pPr>
+        <w:ind w:left="360"/>
+        <w:jc w:val="both"/>
+      </w:pPr>
+      <w:r>
+        <w:rPr>
+          <w:rFonts w:ascii="Arial" w:hAnsi="Arial" w:cs="Arial"/>
+          <w:sz w:val="24"/>
+          <w:szCs w:val="24"/>
+        </w:rPr>
+        <w:t xml:space="preserve">A solução consiste na plataforma web Marcos Music, composta por um frontend em React/TypeScript e um backend em Java Spring Boot. O sistema centraliza todos os processos de gestão de aulas: autenticação segura, agenda semanal/diária, cadastro de alunos, módulo de reposições com créditos, sistema de notificações, envio de dúvidas pelo aplicativo, integração com Google Calendar e central de alertas. Os alunos têm autonomia para gerenciar reposições e reagendamentos dentro das regras contratuais definidas pelo professor.</w:t>
+      </w:r>
+    </w:p>
+    <w:p/>
+    <w:p>
+      <w:pPr>
+        <w:pStyle w:val="ListParagraph"/>
+        <w:numPr>
+          <w:ilvl w:val="0"/>
+          <w:numId w:val="1"/>
+        </w:numPr>
+        <w:rPr>
+          <w:rFonts w:ascii="Arial" w:hAnsi="Arial" w:cs="Arial"/>
+          <w:b/>
+          <w:sz w:val="24"/>
+          <w:szCs w:val="24"/>
+        </w:rPr>
+      </w:pPr>
+      <w:r>
+        <w:rPr>
+          <w:rFonts w:ascii="Arial" w:hAnsi="Arial" w:cs="Arial"/>
+          <w:b/>
+          <w:sz w:val="24"/>
+          <w:szCs w:val="24"/>
+        </w:rPr>
+        <w:t>Projeto da solução</w:t>
+      </w:r>
+    </w:p>
+    <w:p>
+      <w:pPr>
+        <w:ind w:left="360"/>
+        <w:jc w:val="both"/>
+      </w:pPr>
+      <w:r>
+        <w:rPr>
+          <w:rFonts w:ascii="Arial" w:hAnsi="Arial" w:cs="Arial"/>
+          <w:sz w:val="24"/>
+          <w:szCs w:val="24"/>
+        </w:rPr>
+        <w:t xml:space="preserve">O sistema adota arquitetura em três camadas: Apresentação (React 18 + TypeScript + Vite + Tailwind CSS), Lógica de Negócio (Java 21 + Spring Boot 3 + Spring Security + OAuth2 + Spring Data JPA) e Persistência (PostgreSQL). A comunicação entre frontend e backend é feita via API RESTful protegida com tokens JWT. O frontend é distribuído como SPA e o backend como serviço Spring Boot autossuficiente. A integração com Google Calendar/Meet sincroniza agenda e gera links de aulas online automaticamente.</w:t>
+      </w:r>
+    </w:p>
+    <w:p/>
+    <w:p>
+      <w:pPr>
+        <w:pStyle w:val="ListParagraph"/>
+        <w:numPr>
+          <w:ilvl w:val="0"/>
+          <w:numId w:val="1"/>
+        </w:numPr>
+        <w:rPr>
+          <w:rFonts w:ascii="Arial" w:hAnsi="Arial" w:cs="Arial"/>
+          <w:b/>
+          <w:sz w:val="24"/>
+          <w:szCs w:val="24"/>
+        </w:rPr>
+      </w:pPr>
+      <w:r>
+        <w:rPr>
+          <w:rFonts w:ascii="Arial" w:hAnsi="Arial" w:cs="Arial"/>
+          <w:b/>
+          <w:sz w:val="24"/>
+          <w:szCs w:val="24"/>
+        </w:rPr>
+        <w:t>Artefatos principais</w:t>
+      </w:r>
+    </w:p>
+    <w:p>
+      <w:pPr>
+        <w:ind w:left="360"/>
+        <w:jc w:val="both"/>
+      </w:pPr>
+      <w:r>
+        <w:rPr>
+          <w:rFonts w:ascii="Arial" w:hAnsi="Arial" w:cs="Arial"/>
+          <w:sz w:val="24"/>
+          <w:szCs w:val="24"/>
+        </w:rPr>
+        <w:t xml:space="preserve">Os principais artefatos produzidos na Sprint I incluem: Documento de Visão do sistema, especificação de requisitos funcionais e não funcionais, protótipos de interface (wireframes e mockups de alta fidelidade), diagrama de casos de uso, diagrama de classes do domínio, modelo de dados (PostgreSQL), configuração do repositório Git/GitHub com pipeline de CI e primeiras telas do frontend implementadas e validadas com o stakeholder.</w:t>
+      </w:r>
+    </w:p>
+    <w:p>
+      <w:pPr>
+        <w:pStyle w:val="ListParagraph"/>
+        <w:numPr>
+          <w:ilvl w:val="0"/>
+          <w:numId w:val="1"/>
+        </w:numPr>
+        <w:rPr>
+          <w:rFonts w:ascii="Arial" w:hAnsi="Arial" w:cs="Arial"/>
+          <w:b/>
+          <w:sz w:val="24"/>
+          <w:szCs w:val="24"/>
+        </w:rPr>
+      </w:pPr>
+      <w:r>
+        <w:rPr>
+          <w:rFonts w:ascii="Arial" w:hAnsi="Arial" w:cs="Arial"/>
+          <w:b/>
+          <w:sz w:val="24"/>
+          <w:szCs w:val="24"/>
+        </w:rPr>
+        <w:t>Conclusões</w:t>
+      </w:r>
+    </w:p>
+    <w:p>
+      <w:pPr>
+        <w:ind w:left="360"/>
+        <w:jc w:val="both"/>
+      </w:pPr>
+      <w:r>
+        <w:rPr>
+          <w:rFonts w:ascii="Arial" w:hAnsi="Arial" w:cs="Arial"/>
+          <w:sz w:val="24"/>
+          <w:szCs w:val="24"/>
+        </w:rPr>
+        <w:t xml:space="preserve">Ao término da Sprint I, a equipe entregou a fundação técnica e documental do sistema Marcos Music. Os requisitos foram levantados em sessões de entrevista com o stakeholder, a arquitetura foi definida e as primeiras telas do frontend foram implementadas e validadas. O feedback do stakeholder foi positivo, confirmando que a proposta endereça os problemas vivenciados no cotidiano de gestão de suas aulas. As próximas sprints aprofundarão o módulo de reposições com créditos, as notificações automáticas, o chat entre aluno e professor e a integração completa com o Google Calendar.</w:t>
+      </w:r>
+    </w:p>
+    <w:p>
+      <w:pPr>
+        <w:ind w:left="360"/>
+        <w:jc w:val="both"/>
+        <w:rPr>
+          <w:rFonts w:ascii="Arial" w:hAnsi="Arial" w:cs="Arial"/>
+          <w:sz w:val="24"/>
+          <w:szCs w:val="24"/>
+        </w:rPr>
+      </w:pPr>
+    </w:p>
+    <w:p>
+      <w:pPr>
+        <w:pStyle w:val="ListParagraph"/>
+        <w:numPr>
+          <w:ilvl w:val="0"/>
+          <w:numId w:val="1"/>
+        </w:numPr>
+        <w:rPr>
+          <w:rFonts w:ascii="Arial" w:hAnsi="Arial" w:cs="Arial"/>
+          <w:b/>
+          <w:sz w:val="24"/>
+          <w:szCs w:val="24"/>
+        </w:rPr>
+      </w:pPr>
+      <w:r>
+        <w:rPr>
+          <w:rFonts w:ascii="Arial" w:hAnsi="Arial" w:cs="Arial"/>
+          <w:b/>
+          <w:sz w:val="24"/>
+          <w:szCs w:val="24"/>
+        </w:rPr>
+        <w:t>Referências</w:t>
+      </w:r>
+    </w:p>
+    <w:p>
+      <w:pPr>
+        <w:ind w:left="360"/>
+        <w:jc w:val="both"/>
+      </w:pPr>
+      <w:r>
+        <w:rPr>
+          <w:rFonts w:ascii="Arial" w:hAnsi="Arial" w:cs="Arial"/>
+          <w:sz w:val="24"/>
+          <w:szCs w:val="24"/>
+        </w:rPr>
+        <w:t xml:space="preserve">GOOGLE. Google Calendar API Reference. Disponível em: https://developers.google.com/calendar/api/v3/reference. Acesso em: 10 jun. 2026.</w:t>
+      </w:r>
+    </w:p>
+    <w:p>
+      <w:pPr>
+        <w:ind w:left="360"/>
+        <w:jc w:val="both"/>
+      </w:pPr>
+      <w:r>
+        <w:rPr>
+          <w:rFonts w:ascii="Arial" w:hAnsi="Arial" w:cs="Arial"/>
+          <w:sz w:val="24"/>
+          <w:szCs w:val="24"/>
+        </w:rPr>
+        <w:t xml:space="preserve">GOOGLE. Google Meet REST API. Disponível em: https://developers.google.com/meet/api/guides/overview. Acesso em: 10 jun. 2026.</w:t>
+      </w:r>
+    </w:p>
+    <w:sectPr>
+      <w:pgSz w:w="11906" w:h="16838"/>
+      <w:pgMar w:top="1417" w:right="1701" w:bottom="1417" w:left="1701" w:header="708" w:footer="708" w:gutter="0"/>
+      <w:cols w:space="708"/>
+      <w:docGrid w:linePitch="360"/>
+    </w:sectPr>
+  </w:body>
+</w:document>
+</file>
 
 <file path=customXml\item1.xml><?xml version="1.0" encoding="utf-8"?>
 <b:Sources xmlns:b="http://schemas.openxmlformats.org/officeDocument/2006/bibliography" xmlns="http://schemas.openxmlformats.org/officeDocument/2006/bibliography" SelectedStyle="\APASixthEditionOfficeOnline.xsl" StyleName="APA" Version="6"/>
@@ -55,407 +423,6 @@
   <dcterms:created xsi:type="dcterms:W3CDTF">2020-02-09T22:30:00Z</dcterms:created>
   <dcterms:modified xsi:type="dcterms:W3CDTF">2025-05-22T22:42:00Z</dcterms:modified>
 </cp:coreProperties>
-</file>
-
-<file path=word\document.xml><?xml version="1.0" encoding="utf-8"?>
-<w:document xmlns:wpc="http://schemas.microsoft.com/office/word/2010/wordprocessingCanvas" xmlns:mo="http://schemas.microsoft.com/office/mac/office/2008/main" xmlns:mc="http://schemas.openxmlformats.org/markup-compatibility/2006" xmlns:mv="urn:schemas-microsoft-com:mac:vml" xmlns:o="urn:schemas-microsoft-com:office:office" xmlns:r="http://schemas.openxmlformats.org/officeDocument/2006/relationships" xmlns:m="http://schemas.openxmlformats.org/officeDocument/2006/math" xmlns:v="urn:schemas-microsoft-com:vml" xmlns:wp14="http://schemas.microsoft.com/office/word/2010/wordprocessingDrawing" xmlns:wp="http://schemas.openxmlformats.org/drawingml/2006/wordprocessingDrawing" xmlns:w10="urn:schemas-microsoft-com:office:word" xmlns:w="http://schemas.openxmlformats.org/wordprocessingml/2006/main" xmlns:w14="http://schemas.microsoft.com/office/word/2010/wordml" xmlns:wpg="http://schemas.microsoft.com/office/word/2010/wordprocessingGroup" xmlns:wpi="http://schemas.microsoft.com/office/word/2010/wordprocessingInk" xmlns:wne="http://schemas.microsoft.com/office/word/2006/wordml" xmlns:wps="http://schemas.microsoft.com/office/word/2010/wordprocessingShape" mc:Ignorable="w14 wp14">
-  <w:body>
-    <w:p>
-      <w:pPr>
-        <w:pStyle w:val="Heading1"/>
-        <w:jc w:val="center"/>
-        <w:rPr>
-          <w:rFonts w:hint="eastAsia"/>
-        </w:rPr>
-      </w:pPr>
-      <w:r>
-        <w:t xml:space="preserve">Marcos Music: Sistema de Gestão de Aulas de Música, E-Book Sprint I</w:t>
-      </w:r>
-    </w:p>
-    <w:p/>
-    <w:p>
-      <w:pPr>
-        <w:jc w:val="center"/>
-      </w:pPr>
-      <w:r>
-        <w:t xml:space="preserve">Artur Costa Cavalcante Coelho, Bernardo Parreiras Prado, João Paulo Aguiar Prado, Paulo Victor Fernandes de Araujo Silva, Rafael Nagem Volpini</w:t>
-      </w:r>
-    </w:p>
-    <w:p/>
-    <w:p>
-      <w:pPr>
-        <w:pStyle w:val="ListParagraph"/>
-        <w:numPr>
-          <w:ilvl w:val="0"/>
-          <w:numId w:val="1"/>
-        </w:numPr>
-        <w:rPr>
-          <w:rFonts w:ascii="Arial" w:hAnsi="Arial" w:cs="Arial"/>
-          <w:b/>
-          <w:sz w:val="24"/>
-          <w:szCs w:val="24"/>
-        </w:rPr>
-      </w:pPr>
-      <w:r>
-        <w:rPr>
-          <w:rFonts w:ascii="Arial" w:hAnsi="Arial" w:cs="Arial"/>
-          <w:b/>
-          <w:sz w:val="24"/>
-          <w:szCs w:val="24"/>
-        </w:rPr>
-        <w:t>Apresentação do problema</w:t>
-      </w:r>
-    </w:p>
-    <w:p>
-      <w:pPr>
-        <w:ind w:left="360"/>
-        <w:jc w:val="both"/>
-      </w:pPr>
-      <w:r>
-        <w:rPr>
-          <w:rFonts w:ascii="Arial" w:hAnsi="Arial" w:cs="Arial"/>
-          <w:sz w:val="24"/>
-          <w:szCs w:val="24"/>
-        </w:rPr>
-        <w:t xml:space="preserve">O professor particular de música Marcos Mello Lima realizava toda a gestão de sua agenda de aulas de forma completamente manual, utilizando apenas um bloco de notas físico. Com uma agenda tomada por alunos de segunda a sábado, reservava apenas o domingo à noite para organizar a semana seguinte, momento em que precisava revisar aulas, contabilizar faltas, encaixar reposições e anotar alterações. Esse modelo gerava conflitos de horário, perda de controle de reposições, sobrecarga de tempo e comunicação fragmentada entre professor e alunos, evidenciando a necessidade de uma solução digital centralizada.</w:t>
-      </w:r>
-    </w:p>
-    <w:p/>
-    <w:p>
-      <w:pPr>
-        <w:pStyle w:val="ListParagraph"/>
-        <w:numPr>
-          <w:ilvl w:val="0"/>
-          <w:numId w:val="1"/>
-        </w:numPr>
-        <w:rPr>
-          <w:rFonts w:ascii="Arial" w:hAnsi="Arial" w:cs="Arial"/>
-          <w:b/>
-          <w:i/>
-          <w:sz w:val="24"/>
-          <w:szCs w:val="24"/>
-        </w:rPr>
-      </w:pPr>
-      <w:proofErr w:type="spellStart"/>
-      <w:r>
-        <w:rPr>
-          <w:rFonts w:ascii="Arial" w:hAnsi="Arial" w:cs="Arial"/>
-          <w:b/>
-          <w:i/>
-          <w:sz w:val="24"/>
-          <w:szCs w:val="24"/>
-        </w:rPr>
-        <w:t>Stakeholders</w:t>
-      </w:r>
-      <w:proofErr w:type="spellEnd"/>
-    </w:p>
-    <w:p>
-      <w:pPr>
-        <w:pStyle w:val="ListParagraph"/>
-        <w:ind w:left="360"/>
-        <w:jc w:val="both"/>
-        <w:rPr>
-          <w:rFonts w:ascii="Arial" w:hAnsi="Arial" w:cs="Arial"/>
-          <w:sz w:val="24"/>
-          <w:szCs w:val="24"/>
-        </w:rPr>
-      </w:pPr>
-    </w:p>
-    <w:p>
-      <w:pPr>
-        <w:ind w:left="360"/>
-        <w:jc w:val="both"/>
-      </w:pPr>
-      <w:r>
-        <w:rPr>
-          <w:rFonts w:ascii="Arial" w:hAnsi="Arial" w:cs="Arial"/>
-          <w:sz w:val="24"/>
-          <w:szCs w:val="24"/>
-        </w:rPr>
-        <w:t xml:space="preserve">Marcos Mello Lima é professor particular de música há mais de uma década, lecionando individualmente para dezenas de alunos em diversas modalidades (violão, guitarra, cavaquinho, teclado, entre outros). Reserva apenas o domingo à noite para administrar sua agenda. É o solicitante direto do sistema e principal usuário do perfil de Professor/Administrador. Os alunos do professor são os demais usuários do sistema, podendo agendar reposições, enviar dúvidas e receber notificações pelo aplicativo.</w:t>
-      </w:r>
-    </w:p>
-    <w:p/>
-    <w:p>
-      <w:pPr>
-        <w:pStyle w:val="ListParagraph"/>
-        <w:numPr>
-          <w:ilvl w:val="0"/>
-          <w:numId w:val="1"/>
-        </w:numPr>
-        <w:rPr>
-          <w:rFonts w:ascii="Arial" w:hAnsi="Arial" w:cs="Arial"/>
-          <w:b/>
-          <w:sz w:val="24"/>
-          <w:szCs w:val="24"/>
-        </w:rPr>
-      </w:pPr>
-      <w:r>
-        <w:rPr>
-          <w:rFonts w:ascii="Arial" w:hAnsi="Arial" w:cs="Arial"/>
-          <w:b/>
-          <w:sz w:val="24"/>
-          <w:szCs w:val="24"/>
-        </w:rPr>
-        <w:t>Proposta da solução</w:t>
-      </w:r>
-    </w:p>
-    <w:p>
-      <w:pPr>
-        <w:ind w:left="360"/>
-        <w:jc w:val="both"/>
-      </w:pPr>
-      <w:r>
-        <w:rPr>
-          <w:rFonts w:ascii="Arial" w:hAnsi="Arial" w:cs="Arial"/>
-          <w:sz w:val="24"/>
-          <w:szCs w:val="24"/>
-        </w:rPr>
-        <w:t xml:space="preserve">A solução consiste na plataforma web Marcos Music, composta por um frontend em React/TypeScript e um backend em Java Spring Boot. O sistema centraliza todos os processos de gestão de aulas: autenticação segura, agenda semanal/diária, cadastro de alunos, módulo de reposições com créditos, sistema de notificações, envio de dúvidas pelo aplicativo, integração com Google Calendar e central de alertas. Os alunos têm autonomia para gerenciar reposições e reagendamentos dentro das regras contratuais definidas pelo professor.</w:t>
-      </w:r>
-    </w:p>
-    <w:p/>
-    <w:p>
-      <w:pPr>
-        <w:pStyle w:val="ListParagraph"/>
-        <w:numPr>
-          <w:ilvl w:val="0"/>
-          <w:numId w:val="1"/>
-        </w:numPr>
-        <w:rPr>
-          <w:rFonts w:ascii="Arial" w:hAnsi="Arial" w:cs="Arial"/>
-          <w:b/>
-          <w:sz w:val="24"/>
-          <w:szCs w:val="24"/>
-        </w:rPr>
-      </w:pPr>
-      <w:r>
-        <w:rPr>
-          <w:rFonts w:ascii="Arial" w:hAnsi="Arial" w:cs="Arial"/>
-          <w:b/>
-          <w:sz w:val="24"/>
-          <w:szCs w:val="24"/>
-        </w:rPr>
-        <w:t>Projeto da solução</w:t>
-      </w:r>
-    </w:p>
-    <w:p>
-      <w:pPr>
-        <w:ind w:left="360"/>
-        <w:jc w:val="both"/>
-      </w:pPr>
-      <w:r>
-        <w:rPr>
-          <w:rFonts w:ascii="Arial" w:hAnsi="Arial" w:cs="Arial"/>
-          <w:sz w:val="24"/>
-          <w:szCs w:val="24"/>
-        </w:rPr>
-        <w:t xml:space="preserve">O sistema adota arquitetura em três camadas: Apresentação (React 18 + TypeScript + Vite + Tailwind CSS), Lógica de Negócio (Java 21 + Spring Boot 3 + Spring Security + OAuth2 + Spring Data JPA) e Persistência (PostgreSQL). A comunicação entre frontend e backend é feita via API RESTful protegida com tokens JWT. O frontend é distribuído como SPA e o backend como serviço Spring Boot autossuficiente. A integração com Google Calendar/Meet sincroniza agenda e gera links de aulas online automaticamente.</w:t>
-      </w:r>
-    </w:p>
-    <w:p/>
-    <w:p>
-      <w:pPr>
-        <w:pStyle w:val="ListParagraph"/>
-        <w:numPr>
-          <w:ilvl w:val="0"/>
-          <w:numId w:val="1"/>
-        </w:numPr>
-        <w:rPr>
-          <w:rFonts w:ascii="Arial" w:hAnsi="Arial" w:cs="Arial"/>
-          <w:b/>
-          <w:sz w:val="24"/>
-          <w:szCs w:val="24"/>
-        </w:rPr>
-      </w:pPr>
-      <w:r>
-        <w:rPr>
-          <w:rFonts w:ascii="Arial" w:hAnsi="Arial" w:cs="Arial"/>
-          <w:b/>
-          <w:sz w:val="24"/>
-          <w:szCs w:val="24"/>
-        </w:rPr>
-        <w:t>Artefatos principais</w:t>
-      </w:r>
-    </w:p>
-    <w:p>
-      <w:pPr>
-        <w:ind w:left="360"/>
-        <w:jc w:val="both"/>
-      </w:pPr>
-      <w:r>
-        <w:rPr>
-          <w:rFonts w:ascii="Arial" w:hAnsi="Arial" w:cs="Arial"/>
-          <w:sz w:val="24"/>
-          <w:szCs w:val="24"/>
-        </w:rPr>
-        <w:t xml:space="preserve">Os principais artefatos produzidos na Sprint I incluem: Documento de Visão do sistema, especificação de requisitos funcionais e não funcionais, protótipos de interface (wireframes e mockups de alta fidelidade), diagrama de casos de uso, diagrama de classes do domínio, modelo de dados (PostgreSQL), configuração do repositório Git/GitHub com pipeline de CI e primeiras telas do frontend implementadas e validadas com o stakeholder.</w:t>
-      </w:r>
-    </w:p>
-    <w:p>
-      <w:pPr>
-        <w:pStyle w:val="ListParagraph"/>
-        <w:numPr>
-          <w:ilvl w:val="0"/>
-          <w:numId w:val="1"/>
-        </w:numPr>
-        <w:rPr>
-          <w:rFonts w:ascii="Arial" w:hAnsi="Arial" w:cs="Arial"/>
-          <w:b/>
-          <w:sz w:val="24"/>
-          <w:szCs w:val="24"/>
-        </w:rPr>
-      </w:pPr>
-      <w:r>
-        <w:rPr>
-          <w:rFonts w:ascii="Arial" w:hAnsi="Arial" w:cs="Arial"/>
-          <w:b/>
-          <w:sz w:val="24"/>
-          <w:szCs w:val="24"/>
-        </w:rPr>
-        <w:t>Conclusões</w:t>
-      </w:r>
-    </w:p>
-    <w:p>
-      <w:pPr>
-        <w:ind w:left="360"/>
-        <w:jc w:val="both"/>
-      </w:pPr>
-      <w:r>
-        <w:rPr>
-          <w:rFonts w:ascii="Arial" w:hAnsi="Arial" w:cs="Arial"/>
-          <w:sz w:val="24"/>
-          <w:szCs w:val="24"/>
-        </w:rPr>
-        <w:t xml:space="preserve">Ao término da Sprint I, a equipe entregou a fundação técnica e documental do sistema Marcos Music. Os requisitos foram levantados em sessões de entrevista com o stakeholder, a arquitetura foi definida e as primeiras telas do frontend foram implementadas e validadas. O feedback do stakeholder foi positivo, confirmando que a proposta endereça os problemas vivenciados no cotidiano de gestão de suas aulas. As próximas sprints aprofundarão o módulo de reposições com créditos, as notificações automáticas, o chat entre aluno e professor e a integração completa com o Google Calendar.</w:t>
-      </w:r>
-    </w:p>
-    <w:p>
-      <w:pPr>
-        <w:ind w:left="360"/>
-        <w:jc w:val="both"/>
-        <w:rPr>
-          <w:rFonts w:ascii="Arial" w:hAnsi="Arial" w:cs="Arial"/>
-          <w:sz w:val="24"/>
-          <w:szCs w:val="24"/>
-        </w:rPr>
-      </w:pPr>
-    </w:p>
-    <w:p>
-      <w:pPr>
-        <w:rPr>
-          <w:rFonts w:ascii="Arial" w:hAnsi="Arial" w:cs="Arial"/>
-          <w:b/>
-          <w:sz w:val="24"/>
-          <w:szCs w:val="24"/>
-        </w:rPr>
-      </w:pPr>
-      <w:r>
-        <w:rPr>
-          <w:rFonts w:ascii="Arial" w:hAnsi="Arial" w:cs="Arial"/>
-          <w:b/>
-          <w:sz w:val="24"/>
-          <w:szCs w:val="24"/>
-        </w:rPr>
-        <w:t xml:space="preserve">Instruções para </w:t>
-      </w:r>
-      <w:r>
-        <w:rPr>
-          <w:rFonts w:ascii="Arial" w:hAnsi="Arial" w:cs="Arial"/>
-          <w:b/>
-          <w:sz w:val="24"/>
-          <w:szCs w:val="24"/>
-        </w:rPr>
-        <w:t>submissão</w:t>
-      </w:r>
-      <w:r>
-        <w:rPr>
-          <w:rFonts w:ascii="Arial" w:hAnsi="Arial" w:cs="Arial"/>
-          <w:b/>
-          <w:sz w:val="24"/>
-          <w:szCs w:val="24"/>
-        </w:rPr>
-        <w:t xml:space="preserve"> do texto</w:t>
-      </w:r>
-    </w:p>
-    <w:p>
-      <w:pPr>
-        <w:pStyle w:val="ListParagraph"/>
-        <w:numPr>
-          <w:ilvl w:val="0"/>
-          <w:numId w:val="2"/>
-        </w:numPr>
-        <w:jc w:val="both"/>
-      </w:pPr>
-      <w:r>
-        <w:rPr>
-          <w:rFonts w:ascii="Arial" w:hAnsi="Arial" w:cs="Arial"/>
-          <w:sz w:val="24"/>
-          <w:szCs w:val="24"/>
-        </w:rPr>
-        <w:t xml:space="preserve">As referências e citações devem ser feitas usando a norma da ABNT/PUC </w:t>
-      </w:r>
-      <w:r>
-        <w:rPr>
-          <w:rFonts w:ascii="Arial" w:hAnsi="Arial" w:cs="Arial"/>
-          <w:sz w:val="24"/>
-          <w:szCs w:val="24"/>
-        </w:rPr>
-        <w:t>Minas</w:t>
-      </w:r>
-      <w:r>
-        <w:t xml:space="preserve"> </w:t>
-      </w:r>
-      <w:r>
-        <w:t>(</w:t>
-      </w:r>
-      <w:hyperlink r:id="rId9" w:history="1">
-        <w:r>
-          <w:rPr>
-            <w:rStyle w:val="Hyperlink"/>
-            <w:rFonts w:ascii="Arial" w:hAnsi="Arial" w:cs="Arial"/>
-            <w:sz w:val="24"/>
-            <w:szCs w:val="24"/>
-          </w:rPr>
-          <w:t>https://www.pucminas.br/biblioteca/DocumentoBiblioteca/ABNT-GUIA-COMPLETO-Elaborar-formatar-trabalho-cientifico.pdf</w:t>
-        </w:r>
-      </w:hyperlink>
-      <w:bookmarkStart w:id="0" w:name="_GoBack"/>
-      <w:bookmarkEnd w:id="0"/>
-      <w:r>
-        <w:rPr>
-          <w:rFonts w:ascii="Arial" w:hAnsi="Arial" w:cs="Arial"/>
-          <w:sz w:val="24"/>
-          <w:szCs w:val="24"/>
-        </w:rPr>
-        <w:t>)</w:t>
-      </w:r>
-    </w:p>
-    <w:p>
-      <w:pPr>
-        <w:pStyle w:val="ListParagraph"/>
-        <w:numPr>
-          <w:ilvl w:val="0"/>
-          <w:numId w:val="2"/>
-        </w:numPr>
-      </w:pPr>
-      <w:r>
-        <w:rPr>
-          <w:rFonts w:ascii="Arial" w:hAnsi="Arial" w:cs="Arial"/>
-          <w:sz w:val="24"/>
-          <w:szCs w:val="24"/>
-        </w:rPr>
-        <w:t>Uma versão em alta resolução das figuras presentes no texto deve ser encaminhada separadamente.</w:t>
-      </w:r>
-    </w:p>
-    <w:sectPr>
-      <w:pgSz w:w="11906" w:h="16838"/>
-      <w:pgMar w:top="1417" w:right="1701" w:bottom="1417" w:left="1701" w:header="708" w:footer="708" w:gutter="0"/>
-      <w:cols w:space="708"/>
-      <w:docGrid w:linePitch="360"/>
-    </w:sectPr>
-  </w:body>
-</w:document>
 </file>
 
 <file path=word\endnotes.xml><?xml version="1.0" encoding="utf-8"?>

</xml_diff>